<commit_message>
Edit files April 18
</commit_message>
<xml_diff>
--- a/Team8-HEALTH-REMINDER-Design - Apr 18.docx
+++ b/Team8-HEALTH-REMINDER-Design - Apr 18.docx
@@ -1151,8 +1151,8 @@
         <w:drawing xmlns:a="http://schemas.openxmlformats.org/drawingml/2006/main">
           <wp:anchor distT="152400" distB="152400" distL="152400" distR="152400" simplePos="0" relativeHeight="251663360" behindDoc="0" locked="0" layoutInCell="1" allowOverlap="1">
             <wp:simplePos x="0" y="0"/>
-            <wp:positionH relativeFrom="margin">
-              <wp:posOffset>-6350</wp:posOffset>
+            <wp:positionH relativeFrom="page">
+              <wp:posOffset>908050</wp:posOffset>
             </wp:positionH>
             <wp:positionV relativeFrom="line">
               <wp:posOffset>319928</wp:posOffset>
@@ -1925,7 +1925,7 @@
               <wp:posOffset>908050</wp:posOffset>
             </wp:positionH>
             <wp:positionV relativeFrom="line">
-              <wp:posOffset>369332</wp:posOffset>
+              <wp:posOffset>369331</wp:posOffset>
             </wp:positionV>
             <wp:extent cx="4629030" cy="3227179"/>
             <wp:effectExtent l="0" t="0" r="0" b="0"/>
@@ -2238,11 +2238,11 @@
         <w:drawing xmlns:a="http://schemas.openxmlformats.org/drawingml/2006/main">
           <wp:anchor distT="152400" distB="152400" distL="152400" distR="152400" simplePos="0" relativeHeight="251664384" behindDoc="0" locked="0" layoutInCell="1" allowOverlap="1">
             <wp:simplePos x="0" y="0"/>
-            <wp:positionH relativeFrom="margin">
-              <wp:posOffset>-6349</wp:posOffset>
+            <wp:positionH relativeFrom="page">
+              <wp:posOffset>908051</wp:posOffset>
             </wp:positionH>
             <wp:positionV relativeFrom="line">
-              <wp:posOffset>231745</wp:posOffset>
+              <wp:posOffset>231744</wp:posOffset>
             </wp:positionV>
             <wp:extent cx="5943600" cy="3928556"/>
             <wp:effectExtent l="0" t="0" r="0" b="0"/>
@@ -2673,13 +2673,13 @@
         <w:drawing xmlns:a="http://schemas.openxmlformats.org/drawingml/2006/main">
           <wp:anchor distT="152400" distB="152400" distL="152400" distR="152400" simplePos="0" relativeHeight="251665408" behindDoc="0" locked="0" layoutInCell="1" allowOverlap="1">
             <wp:simplePos x="0" y="0"/>
-            <wp:positionH relativeFrom="margin">
-              <wp:posOffset>-13811</wp:posOffset>
+            <wp:positionH relativeFrom="page">
+              <wp:posOffset>900588</wp:posOffset>
             </wp:positionH>
             <wp:positionV relativeFrom="line">
               <wp:posOffset>262461</wp:posOffset>
             </wp:positionV>
-            <wp:extent cx="5943600" cy="3951987"/>
+            <wp:extent cx="5943600" cy="3951988"/>
             <wp:effectExtent l="0" t="0" r="0" b="0"/>
             <wp:wrapThrough wrapText="bothSides" distL="152400" distR="152400">
               <wp:wrapPolygon edited="1">
@@ -2712,7 +2712,7 @@
                   <pic:spPr>
                     <a:xfrm>
                       <a:off x="0" y="0"/>
-                      <a:ext cx="5943600" cy="3951987"/>
+                      <a:ext cx="5943600" cy="3951988"/>
                     </a:xfrm>
                     <a:prstGeom prst="rect">
                       <a:avLst/>
@@ -2908,6 +2908,7 @@
           <w:sz w:val="22"/>
           <w:szCs w:val="22"/>
           <w:u w:val="single"/>
+          <w:lang w:val="en-US"/>
         </w:rPr>
       </w:pPr>
       <w:r>
@@ -2960,8 +2961,8 @@
         <w:drawing xmlns:a="http://schemas.openxmlformats.org/drawingml/2006/main">
           <wp:anchor distT="152400" distB="152400" distL="152400" distR="152400" simplePos="0" relativeHeight="251666432" behindDoc="0" locked="0" layoutInCell="1" allowOverlap="1">
             <wp:simplePos x="0" y="0"/>
-            <wp:positionH relativeFrom="margin">
-              <wp:posOffset>-6350</wp:posOffset>
+            <wp:positionH relativeFrom="page">
+              <wp:posOffset>908050</wp:posOffset>
             </wp:positionH>
             <wp:positionV relativeFrom="line">
               <wp:posOffset>282126</wp:posOffset>
@@ -3031,15 +3032,117 @@
       </w:pPr>
       <w:r>
         <w:rPr>
-          <w:rFonts w:ascii="Arial" w:hAnsi="Arial"/>
-          <w:b w:val="1"/>
-          <w:bCs w:val="1"/>
-          <w:sz w:val="22"/>
-          <w:szCs w:val="22"/>
-          <w:rtl w:val="0"/>
-          <w:lang w:val="en-US"/>
-        </w:rPr>
-        <w:t>UML</w:t>
+          <w:rFonts w:ascii="Arial" w:cs="Arial" w:hAnsi="Arial" w:eastAsia="Arial"/>
+          <w:b w:val="1"/>
+          <w:bCs w:val="1"/>
+          <w:sz w:val="22"/>
+          <w:szCs w:val="22"/>
+          <w:lang w:val="en-US"/>
+        </w:rPr>
+        <mc:AlternateContent>
+          <mc:Choice Requires="wps">
+            <w:drawing xmlns:a="http://schemas.openxmlformats.org/drawingml/2006/main">
+              <wp:anchor distT="152400" distB="152400" distL="152400" distR="152400" simplePos="0" relativeHeight="251669504" behindDoc="0" locked="0" layoutInCell="1" allowOverlap="1">
+                <wp:simplePos x="0" y="0"/>
+                <wp:positionH relativeFrom="margin">
+                  <wp:posOffset>157678</wp:posOffset>
+                </wp:positionH>
+                <wp:positionV relativeFrom="page">
+                  <wp:posOffset>487679</wp:posOffset>
+                </wp:positionV>
+                <wp:extent cx="548125" cy="299919"/>
+                <wp:effectExtent l="0" t="0" r="0" b="0"/>
+                <wp:wrapThrough wrapText="bothSides" distL="152400" distR="152400">
+                  <wp:wrapPolygon edited="1">
+                    <wp:start x="0" y="0"/>
+                    <wp:lineTo x="21600" y="0"/>
+                    <wp:lineTo x="21600" y="21600"/>
+                    <wp:lineTo x="0" y="21600"/>
+                    <wp:lineTo x="0" y="0"/>
+                  </wp:wrapPolygon>
+                </wp:wrapThrough>
+                <wp:docPr id="1073741841" name="officeArt object" descr="UML"/>
+                <wp:cNvGraphicFramePr/>
+                <a:graphic xmlns:a="http://schemas.openxmlformats.org/drawingml/2006/main">
+                  <a:graphicData uri="http://schemas.microsoft.com/office/word/2010/wordprocessingShape">
+                    <wps:wsp>
+                      <wps:cNvSpPr txBox="1"/>
+                      <wps:spPr>
+                        <a:xfrm>
+                          <a:off x="0" y="0"/>
+                          <a:ext cx="548125" cy="299919"/>
+                        </a:xfrm>
+                        <a:prstGeom prst="rect">
+                          <a:avLst/>
+                        </a:prstGeom>
+                        <a:noFill/>
+                        <a:ln w="12700" cap="flat">
+                          <a:noFill/>
+                          <a:miter lim="400000"/>
+                        </a:ln>
+                        <a:effectLst/>
+                      </wps:spPr>
+                      <wps:txbx>
+                        <w:txbxContent>
+                          <w:p>
+                            <w:pPr>
+                              <w:pStyle w:val="Body A"/>
+                            </w:pPr>
+                            <w:r>
+                              <w:rPr>
+                                <w:rFonts w:ascii="Arial" w:hAnsi="Arial"/>
+                                <w:b w:val="1"/>
+                                <w:bCs w:val="1"/>
+                                <w:sz w:val="22"/>
+                                <w:szCs w:val="22"/>
+                                <w:rtl w:val="0"/>
+                                <w:lang w:val="en-US"/>
+                              </w:rPr>
+                              <w:t>UML</w:t>
+                            </w:r>
+                          </w:p>
+                        </w:txbxContent>
+                      </wps:txbx>
+                      <wps:bodyPr wrap="square" lIns="45718" tIns="45718" rIns="45718" bIns="45718" numCol="1" anchor="t">
+                        <a:noAutofit/>
+                      </wps:bodyPr>
+                    </wps:wsp>
+                  </a:graphicData>
+                </a:graphic>
+              </wp:anchor>
+            </w:drawing>
+          </mc:Choice>
+          <mc:Fallback>
+            <w:pict>
+              <v:shape id="_x0000_s1029" type="#_x0000_t202" style="visibility:visible;position:absolute;margin-left:12.4pt;margin-top:38.4pt;width:43.2pt;height:23.6pt;z-index:251669504;mso-position-horizontal:absolute;mso-position-horizontal-relative:margin;mso-position-vertical:absolute;mso-position-vertical-relative:page;mso-wrap-distance-left:12.0pt;mso-wrap-distance-top:12.0pt;mso-wrap-distance-right:12.0pt;mso-wrap-distance-bottom:12.0pt;">
+                <v:fill on="f"/>
+                <v:stroke on="f" weight="1.0pt" dashstyle="solid" endcap="flat" miterlimit="400.0%" joinstyle="miter" linestyle="single" startarrow="none" startarrowwidth="medium" startarrowlength="medium" endarrow="none" endarrowwidth="medium" endarrowlength="medium"/>
+                <v:textbox>
+                  <w:txbxContent>
+                    <w:p>
+                      <w:pPr>
+                        <w:pStyle w:val="Body A"/>
+                      </w:pPr>
+                      <w:r>
+                        <w:rPr>
+                          <w:rFonts w:ascii="Arial" w:hAnsi="Arial"/>
+                          <w:b w:val="1"/>
+                          <w:bCs w:val="1"/>
+                          <w:sz w:val="22"/>
+                          <w:szCs w:val="22"/>
+                          <w:rtl w:val="0"/>
+                          <w:lang w:val="en-US"/>
+                        </w:rPr>
+                        <w:t>UML</w:t>
+                      </w:r>
+                    </w:p>
+                  </w:txbxContent>
+                </v:textbox>
+                <w10:wrap type="through" side="bothSides" anchorx="margin" anchory="page"/>
+              </v:shape>
+            </w:pict>
+          </mc:Fallback>
+        </mc:AlternateContent>
       </w:r>
     </w:p>
     <w:p>
@@ -3064,16 +3167,32 @@
           <w:lang w:val="en-US"/>
         </w:rPr>
         <w:drawing xmlns:a="http://schemas.openxmlformats.org/drawingml/2006/main">
-          <wp:inline distT="0" distB="0" distL="0" distR="0">
-            <wp:extent cx="1496515" cy="2959626"/>
+          <wp:anchor distT="152400" distB="152400" distL="152400" distR="152400" simplePos="0" relativeHeight="251668480" behindDoc="0" locked="0" layoutInCell="1" allowOverlap="1">
+            <wp:simplePos x="0" y="0"/>
+            <wp:positionH relativeFrom="margin">
+              <wp:posOffset>360878</wp:posOffset>
+            </wp:positionH>
+            <wp:positionV relativeFrom="line">
+              <wp:posOffset>362057</wp:posOffset>
+            </wp:positionV>
+            <wp:extent cx="5943600" cy="4897967"/>
             <wp:effectExtent l="0" t="0" r="0" b="0"/>
-            <wp:docPr id="1073741841" name="officeArt object" descr="unknown.png"/>
+            <wp:wrapThrough wrapText="bothSides" distL="152400" distR="152400">
+              <wp:wrapPolygon edited="1">
+                <wp:start x="0" y="0"/>
+                <wp:lineTo x="21600" y="0"/>
+                <wp:lineTo x="21600" y="21604"/>
+                <wp:lineTo x="0" y="21604"/>
+                <wp:lineTo x="0" y="0"/>
+              </wp:wrapPolygon>
+            </wp:wrapThrough>
+            <wp:docPr id="1073741842" name="officeArt object" descr="Screenshot 2026-04-18 at 3.12.02 PM.png"/>
             <wp:cNvGraphicFramePr/>
             <a:graphic xmlns:a="http://schemas.openxmlformats.org/drawingml/2006/main">
               <a:graphicData uri="http://schemas.openxmlformats.org/drawingml/2006/picture">
                 <pic:pic xmlns:pic="http://schemas.openxmlformats.org/drawingml/2006/picture">
                   <pic:nvPicPr>
-                    <pic:cNvPr id="1073741841" name="unknown.png" descr="unknown.png"/>
+                    <pic:cNvPr id="1073741842" name="Screenshot 2026-04-18 at 3.12.02 PM.png" descr="Screenshot 2026-04-18 at 3.12.02 PM.png"/>
                     <pic:cNvPicPr>
                       <a:picLocks noChangeAspect="1"/>
                     </pic:cNvPicPr>
@@ -3089,7 +3208,7 @@
                   <pic:spPr>
                     <a:xfrm>
                       <a:off x="0" y="0"/>
-                      <a:ext cx="1496515" cy="2959626"/>
+                      <a:ext cx="5943600" cy="4897967"/>
                     </a:xfrm>
                     <a:prstGeom prst="rect">
                       <a:avLst/>
@@ -3103,9 +3222,113 @@
                 </pic:pic>
               </a:graphicData>
             </a:graphic>
-          </wp:inline>
+          </wp:anchor>
         </w:drawing>
       </w:r>
+    </w:p>
+    <w:p>
+      <w:pPr>
+        <w:pStyle w:val="Body A"/>
+        <w:rPr>
+          <w:rFonts w:ascii="Arial" w:cs="Arial" w:hAnsi="Arial" w:eastAsia="Arial"/>
+          <w:b w:val="1"/>
+          <w:bCs w:val="1"/>
+          <w:sz w:val="22"/>
+          <w:szCs w:val="22"/>
+          <w:lang w:val="en-US"/>
+        </w:rPr>
+      </w:pPr>
+    </w:p>
+    <w:p>
+      <w:pPr>
+        <w:pStyle w:val="Body A"/>
+        <w:rPr>
+          <w:rFonts w:ascii="Arial" w:cs="Arial" w:hAnsi="Arial" w:eastAsia="Arial"/>
+          <w:b w:val="1"/>
+          <w:bCs w:val="1"/>
+          <w:sz w:val="22"/>
+          <w:szCs w:val="22"/>
+          <w:lang w:val="en-US"/>
+        </w:rPr>
+      </w:pPr>
+    </w:p>
+    <w:p>
+      <w:pPr>
+        <w:pStyle w:val="Body A"/>
+        <w:rPr>
+          <w:rFonts w:ascii="Arial" w:cs="Arial" w:hAnsi="Arial" w:eastAsia="Arial"/>
+          <w:b w:val="1"/>
+          <w:bCs w:val="1"/>
+          <w:sz w:val="22"/>
+          <w:szCs w:val="22"/>
+          <w:lang w:val="en-US"/>
+        </w:rPr>
+      </w:pPr>
+    </w:p>
+    <w:p>
+      <w:pPr>
+        <w:pStyle w:val="Body A"/>
+        <w:rPr>
+          <w:rFonts w:ascii="Arial" w:cs="Arial" w:hAnsi="Arial" w:eastAsia="Arial"/>
+          <w:b w:val="1"/>
+          <w:bCs w:val="1"/>
+          <w:sz w:val="22"/>
+          <w:szCs w:val="22"/>
+          <w:lang w:val="en-US"/>
+        </w:rPr>
+      </w:pPr>
+    </w:p>
+    <w:p>
+      <w:pPr>
+        <w:pStyle w:val="Body A"/>
+        <w:rPr>
+          <w:rFonts w:ascii="Arial" w:cs="Arial" w:hAnsi="Arial" w:eastAsia="Arial"/>
+          <w:b w:val="1"/>
+          <w:bCs w:val="1"/>
+          <w:sz w:val="22"/>
+          <w:szCs w:val="22"/>
+          <w:lang w:val="en-US"/>
+        </w:rPr>
+      </w:pPr>
+    </w:p>
+    <w:p>
+      <w:pPr>
+        <w:pStyle w:val="Body A"/>
+        <w:rPr>
+          <w:rFonts w:ascii="Arial" w:cs="Arial" w:hAnsi="Arial" w:eastAsia="Arial"/>
+          <w:b w:val="1"/>
+          <w:bCs w:val="1"/>
+          <w:sz w:val="22"/>
+          <w:szCs w:val="22"/>
+          <w:lang w:val="en-US"/>
+        </w:rPr>
+      </w:pPr>
+    </w:p>
+    <w:p>
+      <w:pPr>
+        <w:pStyle w:val="Body A"/>
+        <w:rPr>
+          <w:rFonts w:ascii="Arial" w:cs="Arial" w:hAnsi="Arial" w:eastAsia="Arial"/>
+          <w:b w:val="1"/>
+          <w:bCs w:val="1"/>
+          <w:sz w:val="22"/>
+          <w:szCs w:val="22"/>
+          <w:lang w:val="en-US"/>
+        </w:rPr>
+      </w:pPr>
+    </w:p>
+    <w:p>
+      <w:pPr>
+        <w:pStyle w:val="Body A"/>
+        <w:rPr>
+          <w:rFonts w:ascii="Arial" w:cs="Arial" w:hAnsi="Arial" w:eastAsia="Arial"/>
+          <w:b w:val="1"/>
+          <w:bCs w:val="1"/>
+          <w:sz w:val="22"/>
+          <w:szCs w:val="22"/>
+          <w:lang w:val="en-US"/>
+        </w:rPr>
+      </w:pPr>
     </w:p>
     <w:p>
       <w:pPr>
@@ -3183,8 +3406,8 @@
         <w:drawing xmlns:a="http://schemas.openxmlformats.org/drawingml/2006/main">
           <wp:anchor distT="152400" distB="152400" distL="152400" distR="152400" simplePos="0" relativeHeight="251667456" behindDoc="0" locked="0" layoutInCell="1" allowOverlap="1">
             <wp:simplePos x="0" y="0"/>
-            <wp:positionH relativeFrom="margin">
-              <wp:posOffset>-6349</wp:posOffset>
+            <wp:positionH relativeFrom="page">
+              <wp:posOffset>908051</wp:posOffset>
             </wp:positionH>
             <wp:positionV relativeFrom="line">
               <wp:posOffset>245698</wp:posOffset>
@@ -3200,13 +3423,13 @@
                 <wp:lineTo x="0" y="0"/>
               </wp:wrapPolygon>
             </wp:wrapThrough>
-            <wp:docPr id="1073741842" name="officeArt object" descr="Screenshot 2026-04-18 at 11.27.08 AM.png"/>
+            <wp:docPr id="1073741843" name="officeArt object" descr="Screenshot 2026-04-18 at 11.27.08 AM.png"/>
             <wp:cNvGraphicFramePr/>
             <a:graphic xmlns:a="http://schemas.openxmlformats.org/drawingml/2006/main">
               <a:graphicData uri="http://schemas.openxmlformats.org/drawingml/2006/picture">
                 <pic:pic xmlns:pic="http://schemas.openxmlformats.org/drawingml/2006/picture">
                   <pic:nvPicPr>
-                    <pic:cNvPr id="1073741842" name="Screenshot 2026-04-18 at 11.27.08 AM.png" descr="Screenshot 2026-04-18 at 11.27.08 AM.png"/>
+                    <pic:cNvPr id="1073741843" name="Screenshot 2026-04-18 at 11.27.08 AM.png" descr="Screenshot 2026-04-18 at 11.27.08 AM.png"/>
                     <pic:cNvPicPr>
                       <a:picLocks noChangeAspect="1"/>
                     </pic:cNvPicPr>
@@ -3293,13 +3516,13 @@
                 <wp:lineTo x="0" y="0"/>
               </wp:wrapPolygon>
             </wp:wrapThrough>
-            <wp:docPr id="1073741843" name="officeArt object" descr="Screenshot 2026-04-17 at 3.46.28 PM.png"/>
+            <wp:docPr id="1073741844" name="officeArt object" descr="Screenshot 2026-04-17 at 3.46.28 PM.png"/>
             <wp:cNvGraphicFramePr/>
             <a:graphic xmlns:a="http://schemas.openxmlformats.org/drawingml/2006/main">
               <a:graphicData uri="http://schemas.openxmlformats.org/drawingml/2006/picture">
                 <pic:pic xmlns:pic="http://schemas.openxmlformats.org/drawingml/2006/picture">
                   <pic:nvPicPr>
-                    <pic:cNvPr id="1073741843" name="Screenshot 2026-04-17 at 3.46.28 PM.png" descr="Screenshot 2026-04-17 at 3.46.28 PM.png"/>
+                    <pic:cNvPr id="1073741844" name="Screenshot 2026-04-17 at 3.46.28 PM.png" descr="Screenshot 2026-04-17 at 3.46.28 PM.png"/>
                     <pic:cNvPicPr>
                       <a:picLocks noChangeAspect="1"/>
                     </pic:cNvPicPr>
@@ -3396,6 +3619,46 @@
     <w:p>
       <w:pPr>
         <w:pStyle w:val="Body A"/>
+        <w:rPr>
+          <w:rFonts w:ascii="Arial" w:cs="Arial" w:hAnsi="Arial" w:eastAsia="Arial"/>
+        </w:rPr>
+      </w:pPr>
+    </w:p>
+    <w:p>
+      <w:pPr>
+        <w:pStyle w:val="Body A"/>
+        <w:rPr>
+          <w:rFonts w:ascii="Arial" w:cs="Arial" w:hAnsi="Arial" w:eastAsia="Arial"/>
+        </w:rPr>
+      </w:pPr>
+    </w:p>
+    <w:p>
+      <w:pPr>
+        <w:pStyle w:val="Body A"/>
+        <w:rPr>
+          <w:rFonts w:ascii="Arial" w:cs="Arial" w:hAnsi="Arial" w:eastAsia="Arial"/>
+        </w:rPr>
+      </w:pPr>
+    </w:p>
+    <w:p>
+      <w:pPr>
+        <w:pStyle w:val="Body A"/>
+        <w:rPr>
+          <w:rFonts w:ascii="Arial" w:cs="Arial" w:hAnsi="Arial" w:eastAsia="Arial"/>
+        </w:rPr>
+      </w:pPr>
+    </w:p>
+    <w:p>
+      <w:pPr>
+        <w:pStyle w:val="Body A"/>
+        <w:rPr>
+          <w:rFonts w:ascii="Arial" w:cs="Arial" w:hAnsi="Arial" w:eastAsia="Arial"/>
+        </w:rPr>
+      </w:pPr>
+    </w:p>
+    <w:p>
+      <w:pPr>
+        <w:pStyle w:val="Body A"/>
         <w:spacing w:before="240" w:after="240"/>
         <w:rPr>
           <w:rFonts w:ascii="Arial" w:cs="Arial" w:hAnsi="Arial" w:eastAsia="Arial"/>
@@ -4983,6 +5246,126 @@
     <w:p>
       <w:pPr>
         <w:pStyle w:val="Body A"/>
+        <w:rPr>
+          <w:rFonts w:ascii="Arial" w:cs="Arial" w:hAnsi="Arial" w:eastAsia="Arial"/>
+          <w:sz w:val="22"/>
+          <w:szCs w:val="22"/>
+        </w:rPr>
+      </w:pPr>
+    </w:p>
+    <w:p>
+      <w:pPr>
+        <w:pStyle w:val="Body A"/>
+        <w:rPr>
+          <w:rFonts w:ascii="Arial" w:cs="Arial" w:hAnsi="Arial" w:eastAsia="Arial"/>
+          <w:sz w:val="22"/>
+          <w:szCs w:val="22"/>
+        </w:rPr>
+      </w:pPr>
+    </w:p>
+    <w:p>
+      <w:pPr>
+        <w:pStyle w:val="Body A"/>
+        <w:rPr>
+          <w:rFonts w:ascii="Arial" w:cs="Arial" w:hAnsi="Arial" w:eastAsia="Arial"/>
+          <w:sz w:val="22"/>
+          <w:szCs w:val="22"/>
+        </w:rPr>
+      </w:pPr>
+    </w:p>
+    <w:p>
+      <w:pPr>
+        <w:pStyle w:val="Body A"/>
+        <w:rPr>
+          <w:rFonts w:ascii="Arial" w:cs="Arial" w:hAnsi="Arial" w:eastAsia="Arial"/>
+          <w:sz w:val="22"/>
+          <w:szCs w:val="22"/>
+        </w:rPr>
+      </w:pPr>
+    </w:p>
+    <w:p>
+      <w:pPr>
+        <w:pStyle w:val="Body A"/>
+        <w:rPr>
+          <w:rFonts w:ascii="Arial" w:cs="Arial" w:hAnsi="Arial" w:eastAsia="Arial"/>
+          <w:sz w:val="22"/>
+          <w:szCs w:val="22"/>
+        </w:rPr>
+      </w:pPr>
+    </w:p>
+    <w:p>
+      <w:pPr>
+        <w:pStyle w:val="Body A"/>
+        <w:rPr>
+          <w:rFonts w:ascii="Arial" w:cs="Arial" w:hAnsi="Arial" w:eastAsia="Arial"/>
+          <w:sz w:val="22"/>
+          <w:szCs w:val="22"/>
+        </w:rPr>
+      </w:pPr>
+    </w:p>
+    <w:p>
+      <w:pPr>
+        <w:pStyle w:val="Body A"/>
+        <w:rPr>
+          <w:rFonts w:ascii="Arial" w:cs="Arial" w:hAnsi="Arial" w:eastAsia="Arial"/>
+          <w:sz w:val="22"/>
+          <w:szCs w:val="22"/>
+        </w:rPr>
+      </w:pPr>
+    </w:p>
+    <w:p>
+      <w:pPr>
+        <w:pStyle w:val="Body A"/>
+        <w:rPr>
+          <w:rFonts w:ascii="Arial" w:cs="Arial" w:hAnsi="Arial" w:eastAsia="Arial"/>
+          <w:sz w:val="22"/>
+          <w:szCs w:val="22"/>
+        </w:rPr>
+      </w:pPr>
+    </w:p>
+    <w:p>
+      <w:pPr>
+        <w:pStyle w:val="Body A"/>
+        <w:rPr>
+          <w:rFonts w:ascii="Arial" w:cs="Arial" w:hAnsi="Arial" w:eastAsia="Arial"/>
+          <w:sz w:val="22"/>
+          <w:szCs w:val="22"/>
+        </w:rPr>
+      </w:pPr>
+    </w:p>
+    <w:p>
+      <w:pPr>
+        <w:pStyle w:val="Body A"/>
+        <w:rPr>
+          <w:rFonts w:ascii="Arial" w:cs="Arial" w:hAnsi="Arial" w:eastAsia="Arial"/>
+          <w:sz w:val="22"/>
+          <w:szCs w:val="22"/>
+        </w:rPr>
+      </w:pPr>
+    </w:p>
+    <w:p>
+      <w:pPr>
+        <w:pStyle w:val="Body A"/>
+        <w:rPr>
+          <w:rFonts w:ascii="Arial" w:cs="Arial" w:hAnsi="Arial" w:eastAsia="Arial"/>
+          <w:sz w:val="22"/>
+          <w:szCs w:val="22"/>
+        </w:rPr>
+      </w:pPr>
+    </w:p>
+    <w:p>
+      <w:pPr>
+        <w:pStyle w:val="Body A"/>
+        <w:rPr>
+          <w:rFonts w:ascii="Arial" w:cs="Arial" w:hAnsi="Arial" w:eastAsia="Arial"/>
+          <w:sz w:val="22"/>
+          <w:szCs w:val="22"/>
+        </w:rPr>
+      </w:pPr>
+    </w:p>
+    <w:p>
+      <w:pPr>
+        <w:pStyle w:val="Body A"/>
         <w:spacing w:before="240" w:after="240"/>
         <w:rPr>
           <w:rFonts w:ascii="Arial" w:cs="Arial" w:hAnsi="Arial" w:eastAsia="Arial"/>
@@ -5016,13 +5399,13 @@
           <wp:inline distT="0" distB="0" distL="0" distR="0">
             <wp:extent cx="5943600" cy="4410075"/>
             <wp:effectExtent l="0" t="0" r="0" b="0"/>
-            <wp:docPr id="1073741844" name="officeArt object" descr="drawing"/>
+            <wp:docPr id="1073741845" name="officeArt object" descr="drawing"/>
             <wp:cNvGraphicFramePr/>
             <a:graphic xmlns:a="http://schemas.openxmlformats.org/drawingml/2006/main">
               <a:graphicData uri="http://schemas.openxmlformats.org/drawingml/2006/picture">
                 <pic:pic xmlns:pic="http://schemas.openxmlformats.org/drawingml/2006/picture">
                   <pic:nvPicPr>
-                    <pic:cNvPr id="1073741844" name="drawing" descr="drawing"/>
+                    <pic:cNvPr id="1073741845" name="drawing" descr="drawing"/>
                     <pic:cNvPicPr>
                       <a:picLocks noChangeAspect="1"/>
                     </pic:cNvPicPr>

</xml_diff>